<commit_message>
test(e2e): make the fixtures carry the exact text the specs assert
The previous commit captured an intermediate set whose wording no longer
matched the literal strings the specs look for, which is what the five
failing matrix tests were actually reporting. The documents now contain
those strings naturally, and the fixture verifier guards all eight of them,
so rephrasing a document fails there with a clear message instead of
surfacing as a mysterious Playwright timeout.

Markers were confirmed independently of the generator by extracting the
text back out of each document.

Co-Authored-By: Claude Fable 5 <noreply@anthropic.com>
</commit_message>
<xml_diff>
--- a/e2e/fixtures/files/contract-long.docx
+++ b/e2e/fixtures/files/contract-long.docx
@@ -44,7 +44,7 @@
         <w:jc w:val="center"/>
       </w:pPr>
       <w:r>
-        <w:t>ДОГОВОР НА ОКАЗАНИЕ УСЛУГ (РАСШИРЕННАЯ РЕДАКЦИЯ)</w:t>
+        <w:t>Договор оказания услуг (расширенный)</w:t>
       </w:r>
     </w:p>
     <w:p>
@@ -75,7 +75,7 @@
     </w:p>
     <w:p>
       <w:r>
-        <w:t>1.1. Исполнитель обязуется по заданию Заказчика оказать услуги по техническому сопровождению информационной системы Заказчика, а Заказчик обязуется принять результат оказанных услуг и оплатить его в порядке и на условиях, предусмотренных настоящим Договором.</w:t>
+        <w:t>1.1. Исполнитель обязуется оказать Заказчику услуги по техническому сопровождению информационной системы Заказчика, а Заказчик обязуется принять результат оказанных услуг и оплатить его в порядке и на условиях, предусмотренных настоящим Договором.</w:t>
       </w:r>
     </w:p>
     <w:p>
@@ -105,7 +105,7 @@
     </w:p>
     <w:p>
       <w:r>
-        <w:t>1.7. Исполнитель обязуется по заданию Заказчика оказать услуги по техническому сопровождению информационной системы Заказчика, а Заказчик обязуется принять результат оказанных услуг и оплатить его в порядке и на условиях, предусмотренных настоящим Договором.</w:t>
+        <w:t>1.7. Исполнитель обязуется оказать Заказчику услуги по техническому сопровождению информационной системы Заказчика, а Заказчик обязуется принять результат оказанных услуг и оплатить его в порядке и на условиях, предусмотренных настоящим Договором.</w:t>
       </w:r>
     </w:p>
     <w:p>
@@ -135,7 +135,7 @@
     </w:p>
     <w:p>
       <w:r>
-        <w:t>1.13. Исполнитель обязуется по заданию Заказчика оказать услуги по техническому сопровождению информационной системы Заказчика, а Заказчик обязуется принять результат оказанных услуг и оплатить его в порядке и на условиях, предусмотренных настоящим Договором.</w:t>
+        <w:t>1.13. Исполнитель обязуется оказать Заказчику услуги по техническому сопровождению информационной системы Заказчика, а Заказчик обязуется принять результат оказанных услуг и оплатить его в порядке и на условиях, предусмотренных настоящим Договором.</w:t>
       </w:r>
     </w:p>
     <w:p>
@@ -165,7 +165,7 @@
     </w:p>
     <w:p>
       <w:r>
-        <w:t>1.19. Исполнитель обязуется по заданию Заказчика оказать услуги по техническому сопровождению информационной системы Заказчика, а Заказчик обязуется принять результат оказанных услуг и оплатить его в порядке и на условиях, предусмотренных настоящим Договором.</w:t>
+        <w:t>1.19. Исполнитель обязуется оказать Заказчику услуги по техническому сопровождению информационной системы Заказчика, а Заказчик обязуется принять результат оказанных услуг и оплатить его в порядке и на условиях, предусмотренных настоящим Договором.</w:t>
       </w:r>
     </w:p>
     <w:p>
@@ -195,7 +195,7 @@
     </w:p>
     <w:p>
       <w:r>
-        <w:t>1.25. Исполнитель обязуется по заданию Заказчика оказать услуги по техническому сопровождению информационной системы Заказчика, а Заказчик обязуется принять результат оказанных услуг и оплатить его в порядке и на условиях, предусмотренных настоящим Договором.</w:t>
+        <w:t>1.25. Исполнитель обязуется оказать Заказчику услуги по техническому сопровождению информационной системы Заказчика, а Заказчик обязуется принять результат оказанных услуг и оплатить его в порядке и на условиях, предусмотренных настоящим Договором.</w:t>
       </w:r>
     </w:p>
     <w:p>
@@ -225,7 +225,7 @@
     </w:p>
     <w:p>
       <w:r>
-        <w:t>1.31. Исполнитель обязуется по заданию Заказчика оказать услуги по техническому сопровождению информационной системы Заказчика, а Заказчик обязуется принять результат оказанных услуг и оплатить его в порядке и на условиях, предусмотренных настоящим Договором.</w:t>
+        <w:t>1.31. Исполнитель обязуется оказать Заказчику услуги по техническому сопровождению информационной системы Заказчика, а Заказчик обязуется принять результат оказанных услуг и оплатить его в порядке и на условиях, предусмотренных настоящим Договором.</w:t>
       </w:r>
     </w:p>
     <w:p>

</xml_diff>